<commit_message>
EKG-BKM-TLM-02 — Seviye 1 (Otonom) Bakım Talimatları ve Vardiya Kontrol Listesi
</commit_message>
<xml_diff>
--- a/EKG_Kalite_Yönetim_Sistemi/05_Üretime Başlangıç ve Hata Önleme/03_SP&EP3 - Seviye 1 Operatör Bakımı/EKG-BKM-TLM-02_Seviye 1 (Otonom) Bakım Talimatları ve Vardiya Kontrol Listesi.docx
+++ b/EKG_Kalite_Yönetim_Sistemi/05_Üretime Başlangıç ve Hata Önleme/03_SP&EP3 - Seviye 1 Operatör Bakımı/EKG-BKM-TLM-02_Seviye 1 (Otonom) Bakım Talimatları ve Vardiya Kontrol Listesi.docx
@@ -54,6 +54,11 @@
     <w:p>
       <w:r>
         <w:t>Yağlama, sıvı tamamlama, basit ayar veya bağlantı kontrolü yalnız görev kartında açıkça L1 olarak verilmişse yapılır. Yağ/malzeme, miktar, nokta, yöntem, güvenli durum ve süre/periyot yerel onaylı talimatta belirtilir. Farklı malzeme kullanımı, koruyucu açma veya yetkisiz sıkma/ayar yapılmaz.</w:t>
+      </w:r>
+    </w:p>
+    <w:p>
+      <w:r>
+        <w:t>Güvenlik tertibatının işlev doğrulaması, üretici talimatı ve risk değerlendirmesiyle belirlenmiş güvenli test yöntemiyle yapılır. Test L1 görev kartında açıkça atanmış ve operatör yetkilendirilmişse L1 kapsamında uygulanır; diğer durumlarda yetkili teknik personelin kontrol kaydına bağlanır. Yalnız normal durum göstergesi işlev kanıtı değildir. Gerekli güvenlik testi tamamlanmadan ekipman başlatılmaz; koruyucu veya emniyet devresi köprülenmez.</w:t>
       </w:r>
     </w:p>
     <w:p>
@@ -474,6 +479,72 @@
                 <w:sz w:val="18"/>
               </w:rPr>
               <w:t>Dış görünüm, görünür koruyucu ve güvenlik/EP durum göstergeleri</w:t>
+            </w:r>
+          </w:p>
+        </w:tc>
+        <w:tc>
+          <w:tcPr>
+            <w:tcW w:type="dxa" w:w="1728"/>
+          </w:tcPr>
+          <w:p>
+            <w:r>
+              <w:rPr>
+                <w:sz w:val="18"/>
+              </w:rPr>
+            </w:r>
+          </w:p>
+        </w:tc>
+        <w:tc>
+          <w:tcPr>
+            <w:tcW w:type="dxa" w:w="1728"/>
+          </w:tcPr>
+          <w:p>
+            <w:r>
+              <w:rPr>
+                <w:sz w:val="18"/>
+              </w:rPr>
+            </w:r>
+          </w:p>
+        </w:tc>
+        <w:tc>
+          <w:tcPr>
+            <w:tcW w:type="dxa" w:w="1728"/>
+          </w:tcPr>
+          <w:p>
+            <w:r>
+              <w:rPr>
+                <w:sz w:val="18"/>
+              </w:rPr>
+            </w:r>
+          </w:p>
+        </w:tc>
+        <w:tc>
+          <w:tcPr>
+            <w:tcW w:type="dxa" w:w="1728"/>
+          </w:tcPr>
+          <w:p>
+            <w:r>
+              <w:rPr>
+                <w:sz w:val="18"/>
+              </w:rPr>
+            </w:r>
+          </w:p>
+        </w:tc>
+      </w:tr>
+      <w:tr>
+        <w:trPr>
+          <w:cantSplit/>
+        </w:trPr>
+        <w:tc>
+          <w:tcPr>
+            <w:tcW w:type="dxa" w:w="1728"/>
+          </w:tcPr>
+          <w:p>
+            <w:r>
+              <w:rPr>
+                <w:sz w:val="18"/>
+              </w:rPr>
+              <w:t>Vadesi gelen güvenlik tertibatı işlev testi / güvenli yöntem veya yetkili kontrol kaydı no.</w:t>
             </w:r>
           </w:p>
         </w:tc>

</xml_diff>